<commit_message>
vMay24 - CMS + DNA fingerprinting
</commit_message>
<xml_diff>
--- a/Manuscript/Measurement Error_AJAE2023V1-JP.docx
+++ b/Manuscript/Measurement Error_AJAE2023V1-JP.docx
@@ -2,1992 +2,6 @@
 <file path=word/document.xml><?xml version="1.0" encoding="utf-8"?>
 <w:document xmlns:wpc="http://schemas.microsoft.com/office/word/2010/wordprocessingCanvas" xmlns:cx="http://schemas.microsoft.com/office/drawing/2014/chartex" xmlns:cx1="http://schemas.microsoft.com/office/drawing/2015/9/8/chartex" xmlns:cx2="http://schemas.microsoft.com/office/drawing/2015/10/21/chartex" xmlns:cx3="http://schemas.microsoft.com/office/drawing/2016/5/9/chartex" xmlns:cx4="http://schemas.microsoft.com/office/drawing/2016/5/10/chartex" xmlns:cx5="http://schemas.microsoft.com/office/drawing/2016/5/11/chartex" xmlns:cx6="http://schemas.microsoft.com/office/drawing/2016/5/12/chartex" xmlns:cx7="http://schemas.microsoft.com/office/drawing/2016/5/13/chartex" xmlns:cx8="http://schemas.microsoft.com/office/drawing/2016/5/14/chartex" xmlns:mc="http://schemas.openxmlformats.org/markup-compatibility/2006" xmlns:aink="http://schemas.microsoft.com/office/drawing/2016/ink" xmlns:am3d="http://schemas.microsoft.com/office/drawing/2017/model3d" xmlns:o="urn:schemas-microsoft-com:office:office" xmlns:oel="http://schemas.microsoft.com/office/2019/extlst" xmlns:r="http://schemas.openxmlformats.org/officeDocument/2006/relationships" xmlns:m="http://schemas.openxmlformats.org/officeDocument/2006/math" xmlns:v="urn:schemas-microsoft-com:vml" xmlns:wp14="http://schemas.microsoft.com/office/word/2010/wordprocessingDrawing" xmlns:wp="http://schemas.openxmlformats.org/drawingml/2006/wordprocessingDrawing" xmlns:w10="urn:schemas-microsoft-com:office:word" xmlns:w="http://schemas.openxmlformats.org/wordprocessingml/2006/main" xmlns:w14="http://schemas.microsoft.com/office/word/2010/wordml" xmlns:w15="http://schemas.microsoft.com/office/word/2012/wordml" xmlns:w16cex="http://schemas.microsoft.com/office/word/2018/wordml/cex" xmlns:w16cid="http://schemas.microsoft.com/office/word/2016/wordml/cid" xmlns:w16="http://schemas.microsoft.com/office/word/2018/wordml" xmlns:w16sdtdh="http://schemas.microsoft.com/office/word/2020/wordml/sdtdatahash" xmlns:w16se="http://schemas.microsoft.com/office/word/2015/wordml/symex" xmlns:wpg="http://schemas.microsoft.com/office/word/2010/wordprocessingGroup" xmlns:wpi="http://schemas.microsoft.com/office/word/2010/wordprocessingInk" xmlns:wne="http://schemas.microsoft.com/office/word/2006/wordml" xmlns:wps="http://schemas.microsoft.com/office/word/2010/wordprocessingShape" mc:Ignorable="w14 w15 w16se w16cid w16 w16cex w16sdtdh wp14">
   <w:body>
-    <w:p>
-      <w:pPr>
-        <w:rPr>
-          <w:b/>
-          <w:bCs/>
-          <w:color w:val="000000"/>
-        </w:rPr>
-      </w:pPr>
-      <w:r>
-        <w:rPr>
-          <w:b/>
-          <w:bCs/>
-          <w:color w:val="000000"/>
-        </w:rPr>
-        <w:t xml:space="preserve">Table </w:t>
-      </w:r>
-      <w:r>
-        <w:rPr>
-          <w:b/>
-          <w:bCs/>
-          <w:color w:val="000000"/>
-        </w:rPr>
-        <w:t>X</w:t>
-      </w:r>
-      <w:r>
-        <w:rPr>
-          <w:b/>
-          <w:bCs/>
-          <w:color w:val="000000"/>
-        </w:rPr>
-        <w:t>—Sampling and sex-disaggregation of previous studies of improved cassava-related technology adoption in Nigeria (non-systematic review)</w:t>
-      </w:r>
-    </w:p>
-    <w:p>
-      <w:pPr>
-        <w:rPr>
-          <w:color w:val="000000"/>
-          <w:sz w:val="16"/>
-          <w:szCs w:val="16"/>
-        </w:rPr>
-      </w:pPr>
-    </w:p>
-    <w:tbl>
-      <w:tblPr>
-        <w:tblW w:w="0" w:type="auto"/>
-        <w:jc w:val="center"/>
-        <w:tblBorders>
-          <w:top w:val="single" w:sz="4" w:space="0" w:color="auto"/>
-          <w:left w:val="single" w:sz="4" w:space="0" w:color="auto"/>
-          <w:bottom w:val="single" w:sz="4" w:space="0" w:color="auto"/>
-          <w:right w:val="single" w:sz="4" w:space="0" w:color="auto"/>
-          <w:insideH w:val="single" w:sz="4" w:space="0" w:color="auto"/>
-          <w:insideV w:val="single" w:sz="4" w:space="0" w:color="auto"/>
-        </w:tblBorders>
-        <w:tblCellMar>
-          <w:top w:w="15" w:type="dxa"/>
-          <w:left w:w="15" w:type="dxa"/>
-          <w:bottom w:w="15" w:type="dxa"/>
-          <w:right w:w="15" w:type="dxa"/>
-        </w:tblCellMar>
-        <w:tblLook w:val="04A0" w:firstRow="1" w:lastRow="0" w:firstColumn="1" w:lastColumn="0" w:noHBand="0" w:noVBand="1"/>
-      </w:tblPr>
-      <w:tblGrid>
-        <w:gridCol w:w="1870"/>
-        <w:gridCol w:w="1870"/>
-        <w:gridCol w:w="1870"/>
-        <w:gridCol w:w="1870"/>
-        <w:gridCol w:w="1870"/>
-      </w:tblGrid>
-      <w:tr>
-        <w:trPr>
-          <w:trHeight w:val="288"/>
-          <w:jc w:val="center"/>
-        </w:trPr>
-        <w:tc>
-          <w:tcPr>
-            <w:tcW w:w="1870" w:type="dxa"/>
-            <w:tcMar>
-              <w:top w:w="0" w:type="dxa"/>
-              <w:left w:w="108" w:type="dxa"/>
-              <w:bottom w:w="0" w:type="dxa"/>
-              <w:right w:w="108" w:type="dxa"/>
-            </w:tcMar>
-            <w:hideMark/>
-          </w:tcPr>
-          <w:p>
-            <w:pPr>
-              <w:pStyle w:val="NormalWeb"/>
-              <w:spacing w:before="0" w:beforeAutospacing="0" w:after="0" w:afterAutospacing="0"/>
-              <w:jc w:val="center"/>
-              <w:rPr>
-                <w:sz w:val="20"/>
-                <w:szCs w:val="20"/>
-              </w:rPr>
-            </w:pPr>
-            <w:r>
-              <w:rPr>
-                <w:color w:val="000000"/>
-                <w:sz w:val="20"/>
-                <w:szCs w:val="20"/>
-              </w:rPr>
-              <w:t>Author</w:t>
-            </w:r>
-          </w:p>
-        </w:tc>
-        <w:tc>
-          <w:tcPr>
-            <w:tcW w:w="1870" w:type="dxa"/>
-            <w:tcMar>
-              <w:top w:w="0" w:type="dxa"/>
-              <w:left w:w="108" w:type="dxa"/>
-              <w:bottom w:w="0" w:type="dxa"/>
-              <w:right w:w="108" w:type="dxa"/>
-            </w:tcMar>
-            <w:hideMark/>
-          </w:tcPr>
-          <w:p>
-            <w:pPr>
-              <w:pStyle w:val="NormalWeb"/>
-              <w:spacing w:before="0" w:beforeAutospacing="0" w:after="0" w:afterAutospacing="0"/>
-              <w:jc w:val="center"/>
-              <w:rPr>
-                <w:sz w:val="20"/>
-                <w:szCs w:val="20"/>
-              </w:rPr>
-            </w:pPr>
-            <w:r>
-              <w:rPr>
-                <w:color w:val="000000"/>
-                <w:sz w:val="20"/>
-                <w:szCs w:val="20"/>
-              </w:rPr>
-              <w:t>Sample Size </w:t>
-            </w:r>
-          </w:p>
-        </w:tc>
-        <w:tc>
-          <w:tcPr>
-            <w:tcW w:w="1870" w:type="dxa"/>
-            <w:tcMar>
-              <w:top w:w="0" w:type="dxa"/>
-              <w:left w:w="108" w:type="dxa"/>
-              <w:bottom w:w="0" w:type="dxa"/>
-              <w:right w:w="108" w:type="dxa"/>
-            </w:tcMar>
-            <w:hideMark/>
-          </w:tcPr>
-          <w:p>
-            <w:pPr>
-              <w:pStyle w:val="NormalWeb"/>
-              <w:spacing w:before="0" w:beforeAutospacing="0" w:after="0" w:afterAutospacing="0"/>
-              <w:jc w:val="center"/>
-              <w:rPr>
-                <w:sz w:val="20"/>
-                <w:szCs w:val="20"/>
-              </w:rPr>
-            </w:pPr>
-            <w:r>
-              <w:rPr>
-                <w:color w:val="000000"/>
-                <w:sz w:val="20"/>
-                <w:szCs w:val="20"/>
-              </w:rPr>
-              <w:t>Sample frame</w:t>
-            </w:r>
-          </w:p>
-        </w:tc>
-        <w:tc>
-          <w:tcPr>
-            <w:tcW w:w="1870" w:type="dxa"/>
-            <w:tcMar>
-              <w:top w:w="0" w:type="dxa"/>
-              <w:left w:w="108" w:type="dxa"/>
-              <w:bottom w:w="0" w:type="dxa"/>
-              <w:right w:w="108" w:type="dxa"/>
-            </w:tcMar>
-            <w:hideMark/>
-          </w:tcPr>
-          <w:p>
-            <w:pPr>
-              <w:pStyle w:val="NormalWeb"/>
-              <w:spacing w:before="0" w:beforeAutospacing="0" w:after="0" w:afterAutospacing="0"/>
-              <w:jc w:val="center"/>
-              <w:rPr>
-                <w:sz w:val="20"/>
-                <w:szCs w:val="20"/>
-              </w:rPr>
-            </w:pPr>
-            <w:r>
-              <w:rPr>
-                <w:color w:val="000000"/>
-                <w:sz w:val="20"/>
-                <w:szCs w:val="20"/>
-              </w:rPr>
-              <w:t>Gender Disaggregation</w:t>
-            </w:r>
-          </w:p>
-        </w:tc>
-        <w:tc>
-          <w:tcPr>
-            <w:tcW w:w="1870" w:type="dxa"/>
-            <w:tcMar>
-              <w:top w:w="0" w:type="dxa"/>
-              <w:left w:w="108" w:type="dxa"/>
-              <w:bottom w:w="0" w:type="dxa"/>
-              <w:right w:w="108" w:type="dxa"/>
-            </w:tcMar>
-            <w:hideMark/>
-          </w:tcPr>
-          <w:p>
-            <w:pPr>
-              <w:pStyle w:val="NormalWeb"/>
-              <w:spacing w:before="0" w:beforeAutospacing="0" w:after="0" w:afterAutospacing="0"/>
-              <w:jc w:val="center"/>
-              <w:rPr>
-                <w:sz w:val="20"/>
-                <w:szCs w:val="20"/>
-              </w:rPr>
-            </w:pPr>
-            <w:r>
-              <w:rPr>
-                <w:color w:val="000000"/>
-                <w:sz w:val="20"/>
-                <w:szCs w:val="20"/>
-              </w:rPr>
-              <w:t>Gender-Related Results</w:t>
-            </w:r>
-          </w:p>
-        </w:tc>
-      </w:tr>
-      <w:tr>
-        <w:trPr>
-          <w:trHeight w:val="288"/>
-          <w:jc w:val="center"/>
-        </w:trPr>
-        <w:tc>
-          <w:tcPr>
-            <w:tcW w:w="1870" w:type="dxa"/>
-            <w:tcMar>
-              <w:top w:w="0" w:type="dxa"/>
-              <w:left w:w="108" w:type="dxa"/>
-              <w:bottom w:w="0" w:type="dxa"/>
-              <w:right w:w="108" w:type="dxa"/>
-            </w:tcMar>
-            <w:hideMark/>
-          </w:tcPr>
-          <w:p>
-            <w:pPr>
-              <w:pStyle w:val="NormalWeb"/>
-              <w:spacing w:before="0" w:beforeAutospacing="0" w:after="0" w:afterAutospacing="0"/>
-              <w:jc w:val="both"/>
-              <w:rPr>
-                <w:sz w:val="20"/>
-                <w:szCs w:val="20"/>
-              </w:rPr>
-            </w:pPr>
-            <w:hyperlink r:id="rId8" w:history="1">
-              <w:r>
-                <w:rPr>
-                  <w:rStyle w:val="Hyperlink"/>
-                  <w:color w:val="000000"/>
-                  <w:sz w:val="20"/>
-                  <w:szCs w:val="20"/>
-                </w:rPr>
-                <w:t>(</w:t>
-              </w:r>
-              <w:proofErr w:type="spellStart"/>
-              <w:r>
-                <w:rPr>
-                  <w:rStyle w:val="Hyperlink"/>
-                  <w:color w:val="000000"/>
-                  <w:sz w:val="20"/>
-                  <w:szCs w:val="20"/>
-                </w:rPr>
-                <w:t>Awotide</w:t>
-              </w:r>
-              <w:proofErr w:type="spellEnd"/>
-              <w:r>
-                <w:rPr>
-                  <w:rStyle w:val="Hyperlink"/>
-                  <w:color w:val="000000"/>
-                  <w:sz w:val="20"/>
-                  <w:szCs w:val="20"/>
-                </w:rPr>
-                <w:t xml:space="preserve"> et al. 2014)</w:t>
-              </w:r>
-            </w:hyperlink>
-          </w:p>
-        </w:tc>
-        <w:tc>
-          <w:tcPr>
-            <w:tcW w:w="1870" w:type="dxa"/>
-            <w:tcMar>
-              <w:top w:w="0" w:type="dxa"/>
-              <w:left w:w="108" w:type="dxa"/>
-              <w:bottom w:w="0" w:type="dxa"/>
-              <w:right w:w="108" w:type="dxa"/>
-            </w:tcMar>
-            <w:hideMark/>
-          </w:tcPr>
-          <w:p>
-            <w:pPr>
-              <w:pStyle w:val="NormalWeb"/>
-              <w:spacing w:before="0" w:beforeAutospacing="0" w:after="0" w:afterAutospacing="0"/>
-              <w:jc w:val="center"/>
-              <w:rPr>
-                <w:sz w:val="20"/>
-                <w:szCs w:val="20"/>
-              </w:rPr>
-            </w:pPr>
-            <w:r>
-              <w:rPr>
-                <w:color w:val="000000"/>
-                <w:sz w:val="20"/>
-                <w:szCs w:val="20"/>
-              </w:rPr>
-              <w:t>841 HH</w:t>
-            </w:r>
-          </w:p>
-        </w:tc>
-        <w:tc>
-          <w:tcPr>
-            <w:tcW w:w="1870" w:type="dxa"/>
-            <w:tcMar>
-              <w:top w:w="0" w:type="dxa"/>
-              <w:left w:w="108" w:type="dxa"/>
-              <w:bottom w:w="0" w:type="dxa"/>
-              <w:right w:w="108" w:type="dxa"/>
-            </w:tcMar>
-            <w:hideMark/>
-          </w:tcPr>
-          <w:p>
-            <w:pPr>
-              <w:pStyle w:val="NormalWeb"/>
-              <w:spacing w:before="0" w:beforeAutospacing="0" w:after="0" w:afterAutospacing="0"/>
-              <w:jc w:val="center"/>
-              <w:rPr>
-                <w:sz w:val="20"/>
-                <w:szCs w:val="20"/>
-              </w:rPr>
-            </w:pPr>
-            <w:r>
-              <w:rPr>
-                <w:color w:val="000000"/>
-                <w:sz w:val="20"/>
-                <w:szCs w:val="20"/>
-              </w:rPr>
-              <w:t>Household</w:t>
-            </w:r>
-          </w:p>
-        </w:tc>
-        <w:tc>
-          <w:tcPr>
-            <w:tcW w:w="1870" w:type="dxa"/>
-            <w:tcMar>
-              <w:top w:w="0" w:type="dxa"/>
-              <w:left w:w="108" w:type="dxa"/>
-              <w:bottom w:w="0" w:type="dxa"/>
-              <w:right w:w="108" w:type="dxa"/>
-            </w:tcMar>
-            <w:hideMark/>
-          </w:tcPr>
-          <w:p>
-            <w:pPr>
-              <w:pStyle w:val="NormalWeb"/>
-              <w:spacing w:before="0" w:beforeAutospacing="0" w:after="0" w:afterAutospacing="0"/>
-              <w:jc w:val="center"/>
-              <w:rPr>
-                <w:sz w:val="20"/>
-                <w:szCs w:val="20"/>
-              </w:rPr>
-            </w:pPr>
-            <w:r>
-              <w:rPr>
-                <w:color w:val="000000"/>
-                <w:sz w:val="20"/>
-                <w:szCs w:val="20"/>
-              </w:rPr>
-              <w:t>-</w:t>
-            </w:r>
-          </w:p>
-        </w:tc>
-        <w:tc>
-          <w:tcPr>
-            <w:tcW w:w="1870" w:type="dxa"/>
-            <w:tcMar>
-              <w:top w:w="0" w:type="dxa"/>
-              <w:left w:w="108" w:type="dxa"/>
-              <w:bottom w:w="0" w:type="dxa"/>
-              <w:right w:w="108" w:type="dxa"/>
-            </w:tcMar>
-            <w:hideMark/>
-          </w:tcPr>
-          <w:p>
-            <w:pPr>
-              <w:pStyle w:val="NormalWeb"/>
-              <w:spacing w:before="0" w:beforeAutospacing="0" w:after="0" w:afterAutospacing="0"/>
-              <w:jc w:val="center"/>
-              <w:rPr>
-                <w:sz w:val="20"/>
-                <w:szCs w:val="20"/>
-              </w:rPr>
-            </w:pPr>
-            <w:r>
-              <w:rPr>
-                <w:color w:val="000000"/>
-                <w:sz w:val="20"/>
-                <w:szCs w:val="20"/>
-              </w:rPr>
-              <w:t>FHHs more likely to</w:t>
-            </w:r>
-            <w:r>
-              <w:rPr>
-                <w:color w:val="000000"/>
-                <w:sz w:val="20"/>
-                <w:szCs w:val="20"/>
-              </w:rPr>
-              <w:t xml:space="preserve"> </w:t>
-            </w:r>
-            <w:r>
-              <w:rPr>
-                <w:color w:val="000000"/>
-                <w:sz w:val="20"/>
-                <w:szCs w:val="20"/>
-              </w:rPr>
-              <w:t>adopt</w:t>
-            </w:r>
-          </w:p>
-        </w:tc>
-      </w:tr>
-      <w:tr>
-        <w:trPr>
-          <w:trHeight w:val="288"/>
-          <w:jc w:val="center"/>
-        </w:trPr>
-        <w:tc>
-          <w:tcPr>
-            <w:tcW w:w="1870" w:type="dxa"/>
-            <w:tcMar>
-              <w:top w:w="0" w:type="dxa"/>
-              <w:left w:w="108" w:type="dxa"/>
-              <w:bottom w:w="0" w:type="dxa"/>
-              <w:right w:w="108" w:type="dxa"/>
-            </w:tcMar>
-            <w:hideMark/>
-          </w:tcPr>
-          <w:p>
-            <w:pPr>
-              <w:pStyle w:val="NormalWeb"/>
-              <w:spacing w:before="0" w:beforeAutospacing="0" w:after="0" w:afterAutospacing="0"/>
-              <w:rPr>
-                <w:sz w:val="20"/>
-                <w:szCs w:val="20"/>
-              </w:rPr>
-            </w:pPr>
-            <w:hyperlink r:id="rId9" w:history="1">
-              <w:r>
-                <w:rPr>
-                  <w:rStyle w:val="Hyperlink"/>
-                  <w:color w:val="000000"/>
-                  <w:sz w:val="20"/>
-                  <w:szCs w:val="20"/>
-                </w:rPr>
-                <w:t>(</w:t>
-              </w:r>
-              <w:proofErr w:type="spellStart"/>
-              <w:r>
-                <w:rPr>
-                  <w:rStyle w:val="Hyperlink"/>
-                  <w:color w:val="000000"/>
-                  <w:sz w:val="20"/>
-                  <w:szCs w:val="20"/>
-                </w:rPr>
-                <w:t>Apu</w:t>
-              </w:r>
-              <w:proofErr w:type="spellEnd"/>
-              <w:r>
-                <w:rPr>
-                  <w:rStyle w:val="Hyperlink"/>
-                  <w:color w:val="000000"/>
-                  <w:sz w:val="20"/>
-                  <w:szCs w:val="20"/>
-                </w:rPr>
-                <w:t xml:space="preserve"> and Nwachukwu 2011)</w:t>
-              </w:r>
-            </w:hyperlink>
-          </w:p>
-        </w:tc>
-        <w:tc>
-          <w:tcPr>
-            <w:tcW w:w="1870" w:type="dxa"/>
-            <w:tcMar>
-              <w:top w:w="0" w:type="dxa"/>
-              <w:left w:w="108" w:type="dxa"/>
-              <w:bottom w:w="0" w:type="dxa"/>
-              <w:right w:w="108" w:type="dxa"/>
-            </w:tcMar>
-            <w:hideMark/>
-          </w:tcPr>
-          <w:p>
-            <w:pPr>
-              <w:pStyle w:val="NormalWeb"/>
-              <w:spacing w:before="0" w:beforeAutospacing="0" w:after="0" w:afterAutospacing="0"/>
-              <w:jc w:val="center"/>
-              <w:rPr>
-                <w:sz w:val="20"/>
-                <w:szCs w:val="20"/>
-              </w:rPr>
-            </w:pPr>
-            <w:r>
-              <w:rPr>
-                <w:color w:val="000000"/>
-                <w:sz w:val="20"/>
-                <w:szCs w:val="20"/>
-              </w:rPr>
-              <w:t>150 S</w:t>
-            </w:r>
-          </w:p>
-        </w:tc>
-        <w:tc>
-          <w:tcPr>
-            <w:tcW w:w="1870" w:type="dxa"/>
-            <w:tcMar>
-              <w:top w:w="0" w:type="dxa"/>
-              <w:left w:w="108" w:type="dxa"/>
-              <w:bottom w:w="0" w:type="dxa"/>
-              <w:right w:w="108" w:type="dxa"/>
-            </w:tcMar>
-            <w:hideMark/>
-          </w:tcPr>
-          <w:p>
-            <w:pPr>
-              <w:pStyle w:val="NormalWeb"/>
-              <w:spacing w:before="0" w:beforeAutospacing="0" w:after="0" w:afterAutospacing="0"/>
-              <w:jc w:val="center"/>
-              <w:rPr>
-                <w:sz w:val="20"/>
-                <w:szCs w:val="20"/>
-              </w:rPr>
-            </w:pPr>
-            <w:r>
-              <w:rPr>
-                <w:color w:val="000000"/>
-                <w:sz w:val="20"/>
-                <w:szCs w:val="20"/>
-              </w:rPr>
-              <w:t>Farm families</w:t>
-            </w:r>
-          </w:p>
-        </w:tc>
-        <w:tc>
-          <w:tcPr>
-            <w:tcW w:w="1870" w:type="dxa"/>
-            <w:tcMar>
-              <w:top w:w="0" w:type="dxa"/>
-              <w:left w:w="108" w:type="dxa"/>
-              <w:bottom w:w="0" w:type="dxa"/>
-              <w:right w:w="108" w:type="dxa"/>
-            </w:tcMar>
-            <w:hideMark/>
-          </w:tcPr>
-          <w:p>
-            <w:pPr>
-              <w:pStyle w:val="NormalWeb"/>
-              <w:spacing w:before="0" w:beforeAutospacing="0" w:after="0" w:afterAutospacing="0"/>
-              <w:jc w:val="center"/>
-              <w:rPr>
-                <w:sz w:val="20"/>
-                <w:szCs w:val="20"/>
-              </w:rPr>
-            </w:pPr>
-            <w:r>
-              <w:rPr>
-                <w:color w:val="000000"/>
-                <w:sz w:val="20"/>
-                <w:szCs w:val="20"/>
-              </w:rPr>
-              <w:t>-</w:t>
-            </w:r>
-          </w:p>
-        </w:tc>
-        <w:tc>
-          <w:tcPr>
-            <w:tcW w:w="1870" w:type="dxa"/>
-            <w:tcMar>
-              <w:top w:w="0" w:type="dxa"/>
-              <w:left w:w="108" w:type="dxa"/>
-              <w:bottom w:w="0" w:type="dxa"/>
-              <w:right w:w="108" w:type="dxa"/>
-            </w:tcMar>
-            <w:hideMark/>
-          </w:tcPr>
-          <w:p>
-            <w:pPr>
-              <w:pStyle w:val="NormalWeb"/>
-              <w:spacing w:before="0" w:beforeAutospacing="0" w:after="0" w:afterAutospacing="0"/>
-              <w:jc w:val="center"/>
-              <w:rPr>
-                <w:sz w:val="20"/>
-                <w:szCs w:val="20"/>
-              </w:rPr>
-            </w:pPr>
-            <w:r>
-              <w:rPr>
-                <w:color w:val="000000"/>
-                <w:sz w:val="20"/>
-                <w:szCs w:val="20"/>
-              </w:rPr>
-              <w:t>-</w:t>
-            </w:r>
-          </w:p>
-        </w:tc>
-      </w:tr>
-      <w:tr>
-        <w:trPr>
-          <w:trHeight w:val="288"/>
-          <w:jc w:val="center"/>
-        </w:trPr>
-        <w:tc>
-          <w:tcPr>
-            <w:tcW w:w="1870" w:type="dxa"/>
-            <w:tcMar>
-              <w:top w:w="0" w:type="dxa"/>
-              <w:left w:w="108" w:type="dxa"/>
-              <w:bottom w:w="0" w:type="dxa"/>
-              <w:right w:w="108" w:type="dxa"/>
-            </w:tcMar>
-            <w:hideMark/>
-          </w:tcPr>
-          <w:p>
-            <w:pPr>
-              <w:pStyle w:val="NormalWeb"/>
-              <w:spacing w:before="0" w:beforeAutospacing="0" w:after="0" w:afterAutospacing="0"/>
-              <w:rPr>
-                <w:sz w:val="20"/>
-                <w:szCs w:val="20"/>
-              </w:rPr>
-            </w:pPr>
-            <w:hyperlink r:id="rId10" w:history="1">
-              <w:r>
-                <w:rPr>
-                  <w:rStyle w:val="Hyperlink"/>
-                  <w:color w:val="000000"/>
-                  <w:sz w:val="20"/>
-                  <w:szCs w:val="20"/>
-                </w:rPr>
-                <w:t>(</w:t>
-              </w:r>
-              <w:proofErr w:type="spellStart"/>
-              <w:r>
-                <w:rPr>
-                  <w:rStyle w:val="Hyperlink"/>
-                  <w:color w:val="000000"/>
-                  <w:sz w:val="20"/>
-                  <w:szCs w:val="20"/>
-                </w:rPr>
-                <w:t>Awotide</w:t>
-              </w:r>
-              <w:proofErr w:type="spellEnd"/>
-              <w:r>
-                <w:rPr>
-                  <w:rStyle w:val="Hyperlink"/>
-                  <w:color w:val="000000"/>
-                  <w:sz w:val="20"/>
-                  <w:szCs w:val="20"/>
-                </w:rPr>
-                <w:t xml:space="preserve"> et al. 2014)</w:t>
-              </w:r>
-            </w:hyperlink>
-          </w:p>
-        </w:tc>
-        <w:tc>
-          <w:tcPr>
-            <w:tcW w:w="1870" w:type="dxa"/>
-            <w:tcMar>
-              <w:top w:w="0" w:type="dxa"/>
-              <w:left w:w="108" w:type="dxa"/>
-              <w:bottom w:w="0" w:type="dxa"/>
-              <w:right w:w="108" w:type="dxa"/>
-            </w:tcMar>
-            <w:hideMark/>
-          </w:tcPr>
-          <w:p>
-            <w:pPr>
-              <w:pStyle w:val="NormalWeb"/>
-              <w:spacing w:before="0" w:beforeAutospacing="0" w:after="0" w:afterAutospacing="0"/>
-              <w:jc w:val="center"/>
-              <w:rPr>
-                <w:sz w:val="20"/>
-                <w:szCs w:val="20"/>
-              </w:rPr>
-            </w:pPr>
-            <w:r>
-              <w:rPr>
-                <w:color w:val="000000"/>
-                <w:sz w:val="20"/>
-                <w:szCs w:val="20"/>
-              </w:rPr>
-              <w:t>952 S</w:t>
-            </w:r>
-          </w:p>
-        </w:tc>
-        <w:tc>
-          <w:tcPr>
-            <w:tcW w:w="1870" w:type="dxa"/>
-            <w:tcMar>
-              <w:top w:w="0" w:type="dxa"/>
-              <w:left w:w="108" w:type="dxa"/>
-              <w:bottom w:w="0" w:type="dxa"/>
-              <w:right w:w="108" w:type="dxa"/>
-            </w:tcMar>
-            <w:hideMark/>
-          </w:tcPr>
-          <w:p>
-            <w:pPr>
-              <w:pStyle w:val="NormalWeb"/>
-              <w:spacing w:before="0" w:beforeAutospacing="0" w:after="0" w:afterAutospacing="0"/>
-              <w:jc w:val="center"/>
-              <w:rPr>
-                <w:sz w:val="20"/>
-                <w:szCs w:val="20"/>
-              </w:rPr>
-            </w:pPr>
-            <w:r>
-              <w:rPr>
-                <w:color w:val="000000"/>
-                <w:sz w:val="20"/>
-                <w:szCs w:val="20"/>
-              </w:rPr>
-              <w:t>Household heads</w:t>
-            </w:r>
-          </w:p>
-        </w:tc>
-        <w:tc>
-          <w:tcPr>
-            <w:tcW w:w="1870" w:type="dxa"/>
-            <w:tcMar>
-              <w:top w:w="0" w:type="dxa"/>
-              <w:left w:w="108" w:type="dxa"/>
-              <w:bottom w:w="0" w:type="dxa"/>
-              <w:right w:w="108" w:type="dxa"/>
-            </w:tcMar>
-            <w:hideMark/>
-          </w:tcPr>
-          <w:p>
-            <w:pPr>
-              <w:pStyle w:val="NormalWeb"/>
-              <w:spacing w:before="0" w:beforeAutospacing="0" w:after="0" w:afterAutospacing="0"/>
-              <w:jc w:val="center"/>
-              <w:rPr>
-                <w:sz w:val="20"/>
-                <w:szCs w:val="20"/>
-              </w:rPr>
-            </w:pPr>
-            <w:r>
-              <w:rPr>
-                <w:color w:val="000000"/>
-                <w:sz w:val="20"/>
-                <w:szCs w:val="20"/>
-              </w:rPr>
-              <w:t>89% male</w:t>
-            </w:r>
-          </w:p>
-          <w:p>
-            <w:pPr>
-              <w:pStyle w:val="NormalWeb"/>
-              <w:spacing w:before="0" w:beforeAutospacing="0" w:after="0" w:afterAutospacing="0"/>
-              <w:jc w:val="center"/>
-              <w:rPr>
-                <w:sz w:val="20"/>
-                <w:szCs w:val="20"/>
-              </w:rPr>
-            </w:pPr>
-            <w:r>
-              <w:rPr>
-                <w:color w:val="000000"/>
-                <w:sz w:val="20"/>
-                <w:szCs w:val="20"/>
-              </w:rPr>
-              <w:t>11% female</w:t>
-            </w:r>
-          </w:p>
-          <w:p>
-            <w:pPr>
-              <w:pStyle w:val="NormalWeb"/>
-              <w:spacing w:before="0" w:beforeAutospacing="0" w:after="0" w:afterAutospacing="0"/>
-              <w:jc w:val="center"/>
-              <w:rPr>
-                <w:sz w:val="20"/>
-                <w:szCs w:val="20"/>
-              </w:rPr>
-            </w:pPr>
-            <w:r>
-              <w:rPr>
-                <w:color w:val="000000"/>
-                <w:sz w:val="20"/>
-                <w:szCs w:val="20"/>
-              </w:rPr>
-              <w:t>89% married</w:t>
-            </w:r>
-          </w:p>
-        </w:tc>
-        <w:tc>
-          <w:tcPr>
-            <w:tcW w:w="1870" w:type="dxa"/>
-            <w:tcMar>
-              <w:top w:w="0" w:type="dxa"/>
-              <w:left w:w="108" w:type="dxa"/>
-              <w:bottom w:w="0" w:type="dxa"/>
-              <w:right w:w="108" w:type="dxa"/>
-            </w:tcMar>
-            <w:hideMark/>
-          </w:tcPr>
-          <w:p>
-            <w:pPr>
-              <w:pStyle w:val="NormalWeb"/>
-              <w:spacing w:before="0" w:beforeAutospacing="0" w:after="0" w:afterAutospacing="0"/>
-              <w:jc w:val="center"/>
-              <w:rPr>
-                <w:sz w:val="20"/>
-                <w:szCs w:val="20"/>
-              </w:rPr>
-            </w:pPr>
-            <w:r>
-              <w:rPr>
-                <w:color w:val="000000"/>
-                <w:sz w:val="20"/>
-                <w:szCs w:val="20"/>
-              </w:rPr>
-              <w:t>Gender not significant</w:t>
-            </w:r>
-          </w:p>
-        </w:tc>
-      </w:tr>
-      <w:tr>
-        <w:trPr>
-          <w:trHeight w:val="288"/>
-          <w:jc w:val="center"/>
-        </w:trPr>
-        <w:tc>
-          <w:tcPr>
-            <w:tcW w:w="1870" w:type="dxa"/>
-            <w:tcMar>
-              <w:top w:w="0" w:type="dxa"/>
-              <w:left w:w="108" w:type="dxa"/>
-              <w:bottom w:w="0" w:type="dxa"/>
-              <w:right w:w="108" w:type="dxa"/>
-            </w:tcMar>
-            <w:hideMark/>
-          </w:tcPr>
-          <w:p>
-            <w:pPr>
-              <w:pStyle w:val="NormalWeb"/>
-              <w:spacing w:before="0" w:beforeAutospacing="0" w:after="0" w:afterAutospacing="0"/>
-              <w:rPr>
-                <w:sz w:val="20"/>
-                <w:szCs w:val="20"/>
-              </w:rPr>
-            </w:pPr>
-            <w:hyperlink r:id="rId11" w:history="1">
-              <w:r>
-                <w:rPr>
-                  <w:rStyle w:val="Hyperlink"/>
-                  <w:color w:val="000000"/>
-                  <w:sz w:val="20"/>
-                  <w:szCs w:val="20"/>
-                </w:rPr>
-                <w:t>(</w:t>
-              </w:r>
-              <w:proofErr w:type="spellStart"/>
-              <w:r>
-                <w:rPr>
-                  <w:rStyle w:val="Hyperlink"/>
-                  <w:color w:val="000000"/>
-                  <w:sz w:val="20"/>
-                  <w:szCs w:val="20"/>
-                </w:rPr>
-                <w:t>Agwu</w:t>
-              </w:r>
-              <w:proofErr w:type="spellEnd"/>
-              <w:r>
-                <w:rPr>
-                  <w:rStyle w:val="Hyperlink"/>
-                  <w:color w:val="000000"/>
-                  <w:sz w:val="20"/>
-                  <w:szCs w:val="20"/>
-                </w:rPr>
-                <w:t>, Ekwueme, and Anyanwu 2008)</w:t>
-              </w:r>
-            </w:hyperlink>
-          </w:p>
-        </w:tc>
-        <w:tc>
-          <w:tcPr>
-            <w:tcW w:w="1870" w:type="dxa"/>
-            <w:tcMar>
-              <w:top w:w="0" w:type="dxa"/>
-              <w:left w:w="108" w:type="dxa"/>
-              <w:bottom w:w="0" w:type="dxa"/>
-              <w:right w:w="108" w:type="dxa"/>
-            </w:tcMar>
-            <w:hideMark/>
-          </w:tcPr>
-          <w:p>
-            <w:pPr>
-              <w:pStyle w:val="NormalWeb"/>
-              <w:spacing w:before="0" w:beforeAutospacing="0" w:after="0" w:afterAutospacing="0"/>
-              <w:jc w:val="center"/>
-              <w:rPr>
-                <w:sz w:val="20"/>
-                <w:szCs w:val="20"/>
-              </w:rPr>
-            </w:pPr>
-            <w:r>
-              <w:rPr>
-                <w:color w:val="000000"/>
-                <w:sz w:val="20"/>
-                <w:szCs w:val="20"/>
-              </w:rPr>
-              <w:t>135 F</w:t>
-            </w:r>
-          </w:p>
-        </w:tc>
-        <w:tc>
-          <w:tcPr>
-            <w:tcW w:w="1870" w:type="dxa"/>
-            <w:tcMar>
-              <w:top w:w="0" w:type="dxa"/>
-              <w:left w:w="108" w:type="dxa"/>
-              <w:bottom w:w="0" w:type="dxa"/>
-              <w:right w:w="108" w:type="dxa"/>
-            </w:tcMar>
-            <w:hideMark/>
-          </w:tcPr>
-          <w:p>
-            <w:pPr>
-              <w:pStyle w:val="NormalWeb"/>
-              <w:spacing w:before="0" w:beforeAutospacing="0" w:after="0" w:afterAutospacing="0"/>
-              <w:jc w:val="center"/>
-              <w:rPr>
-                <w:sz w:val="20"/>
-                <w:szCs w:val="20"/>
-              </w:rPr>
-            </w:pPr>
-            <w:r>
-              <w:rPr>
-                <w:color w:val="000000"/>
-                <w:sz w:val="20"/>
-                <w:szCs w:val="20"/>
-              </w:rPr>
-              <w:t>-</w:t>
-            </w:r>
-          </w:p>
-        </w:tc>
-        <w:tc>
-          <w:tcPr>
-            <w:tcW w:w="1870" w:type="dxa"/>
-            <w:tcMar>
-              <w:top w:w="0" w:type="dxa"/>
-              <w:left w:w="108" w:type="dxa"/>
-              <w:bottom w:w="0" w:type="dxa"/>
-              <w:right w:w="108" w:type="dxa"/>
-            </w:tcMar>
-            <w:hideMark/>
-          </w:tcPr>
-          <w:p>
-            <w:pPr>
-              <w:pStyle w:val="NormalWeb"/>
-              <w:spacing w:before="0" w:beforeAutospacing="0" w:after="0" w:afterAutospacing="0"/>
-              <w:jc w:val="center"/>
-              <w:rPr>
-                <w:sz w:val="20"/>
-                <w:szCs w:val="20"/>
-              </w:rPr>
-            </w:pPr>
-            <w:r>
-              <w:rPr>
-                <w:color w:val="000000"/>
-                <w:sz w:val="20"/>
-                <w:szCs w:val="20"/>
-              </w:rPr>
-              <w:t>81.5% male</w:t>
-            </w:r>
-          </w:p>
-          <w:p>
-            <w:pPr>
-              <w:pStyle w:val="NormalWeb"/>
-              <w:spacing w:before="0" w:beforeAutospacing="0" w:after="0" w:afterAutospacing="0"/>
-              <w:jc w:val="center"/>
-              <w:rPr>
-                <w:sz w:val="20"/>
-                <w:szCs w:val="20"/>
-              </w:rPr>
-            </w:pPr>
-            <w:r>
-              <w:rPr>
-                <w:color w:val="000000"/>
-                <w:sz w:val="20"/>
-                <w:szCs w:val="20"/>
-              </w:rPr>
-              <w:t>18.5% female</w:t>
-            </w:r>
-          </w:p>
-          <w:p>
-            <w:pPr>
-              <w:pStyle w:val="NormalWeb"/>
-              <w:spacing w:before="0" w:beforeAutospacing="0" w:after="0" w:afterAutospacing="0"/>
-              <w:jc w:val="center"/>
-              <w:rPr>
-                <w:sz w:val="20"/>
-                <w:szCs w:val="20"/>
-              </w:rPr>
-            </w:pPr>
-            <w:r>
-              <w:rPr>
-                <w:color w:val="000000"/>
-                <w:sz w:val="20"/>
-                <w:szCs w:val="20"/>
-              </w:rPr>
-              <w:t>73.3% married</w:t>
-            </w:r>
-          </w:p>
-        </w:tc>
-        <w:tc>
-          <w:tcPr>
-            <w:tcW w:w="1870" w:type="dxa"/>
-            <w:tcMar>
-              <w:top w:w="0" w:type="dxa"/>
-              <w:left w:w="108" w:type="dxa"/>
-              <w:bottom w:w="0" w:type="dxa"/>
-              <w:right w:w="108" w:type="dxa"/>
-            </w:tcMar>
-            <w:hideMark/>
-          </w:tcPr>
-          <w:p>
-            <w:pPr>
-              <w:pStyle w:val="NormalWeb"/>
-              <w:spacing w:before="0" w:beforeAutospacing="0" w:after="0" w:afterAutospacing="0"/>
-              <w:jc w:val="center"/>
-              <w:rPr>
-                <w:sz w:val="20"/>
-                <w:szCs w:val="20"/>
-              </w:rPr>
-            </w:pPr>
-            <w:r>
-              <w:rPr>
-                <w:color w:val="000000"/>
-                <w:sz w:val="20"/>
-                <w:szCs w:val="20"/>
-              </w:rPr>
-              <w:t>-</w:t>
-            </w:r>
-          </w:p>
-        </w:tc>
-      </w:tr>
-      <w:tr>
-        <w:trPr>
-          <w:trHeight w:val="288"/>
-          <w:jc w:val="center"/>
-        </w:trPr>
-        <w:tc>
-          <w:tcPr>
-            <w:tcW w:w="1870" w:type="dxa"/>
-            <w:tcMar>
-              <w:top w:w="0" w:type="dxa"/>
-              <w:left w:w="108" w:type="dxa"/>
-              <w:bottom w:w="0" w:type="dxa"/>
-              <w:right w:w="108" w:type="dxa"/>
-            </w:tcMar>
-            <w:hideMark/>
-          </w:tcPr>
-          <w:p>
-            <w:pPr>
-              <w:pStyle w:val="NormalWeb"/>
-              <w:spacing w:before="0" w:beforeAutospacing="0" w:after="0" w:afterAutospacing="0"/>
-              <w:rPr>
-                <w:sz w:val="20"/>
-                <w:szCs w:val="20"/>
-              </w:rPr>
-            </w:pPr>
-            <w:hyperlink r:id="rId12" w:history="1">
-              <w:r>
-                <w:rPr>
-                  <w:rStyle w:val="Hyperlink"/>
-                  <w:color w:val="000000"/>
-                  <w:sz w:val="20"/>
-                  <w:szCs w:val="20"/>
-                </w:rPr>
-                <w:t>(</w:t>
-              </w:r>
-              <w:proofErr w:type="spellStart"/>
-              <w:r>
-                <w:rPr>
-                  <w:rStyle w:val="Hyperlink"/>
-                  <w:color w:val="000000"/>
-                  <w:sz w:val="20"/>
-                  <w:szCs w:val="20"/>
-                </w:rPr>
-                <w:t>Nwakor</w:t>
-              </w:r>
-              <w:proofErr w:type="spellEnd"/>
-              <w:r>
-                <w:rPr>
-                  <w:rStyle w:val="Hyperlink"/>
-                  <w:color w:val="000000"/>
-                  <w:sz w:val="20"/>
-                  <w:szCs w:val="20"/>
-                </w:rPr>
-                <w:t xml:space="preserve"> et al. 2011)</w:t>
-              </w:r>
-            </w:hyperlink>
-          </w:p>
-        </w:tc>
-        <w:tc>
-          <w:tcPr>
-            <w:tcW w:w="1870" w:type="dxa"/>
-            <w:tcMar>
-              <w:top w:w="0" w:type="dxa"/>
-              <w:left w:w="108" w:type="dxa"/>
-              <w:bottom w:w="0" w:type="dxa"/>
-              <w:right w:w="108" w:type="dxa"/>
-            </w:tcMar>
-            <w:hideMark/>
-          </w:tcPr>
-          <w:p>
-            <w:pPr>
-              <w:pStyle w:val="NormalWeb"/>
-              <w:spacing w:before="0" w:beforeAutospacing="0" w:after="0" w:afterAutospacing="0"/>
-              <w:jc w:val="center"/>
-              <w:rPr>
-                <w:sz w:val="20"/>
-                <w:szCs w:val="20"/>
-              </w:rPr>
-            </w:pPr>
-            <w:r>
-              <w:rPr>
-                <w:color w:val="000000"/>
-                <w:sz w:val="20"/>
-                <w:szCs w:val="20"/>
-              </w:rPr>
-              <w:t>150 F</w:t>
-            </w:r>
-          </w:p>
-        </w:tc>
-        <w:tc>
-          <w:tcPr>
-            <w:tcW w:w="1870" w:type="dxa"/>
-            <w:tcMar>
-              <w:top w:w="0" w:type="dxa"/>
-              <w:left w:w="108" w:type="dxa"/>
-              <w:bottom w:w="0" w:type="dxa"/>
-              <w:right w:w="108" w:type="dxa"/>
-            </w:tcMar>
-            <w:hideMark/>
-          </w:tcPr>
-          <w:p>
-            <w:pPr>
-              <w:pStyle w:val="NormalWeb"/>
-              <w:spacing w:before="0" w:beforeAutospacing="0" w:after="0" w:afterAutospacing="0"/>
-              <w:jc w:val="center"/>
-              <w:rPr>
-                <w:sz w:val="20"/>
-                <w:szCs w:val="20"/>
-              </w:rPr>
-            </w:pPr>
-            <w:r>
-              <w:rPr>
-                <w:color w:val="000000"/>
-                <w:sz w:val="20"/>
-                <w:szCs w:val="20"/>
-              </w:rPr>
-              <w:t>Registered farmers</w:t>
-            </w:r>
-          </w:p>
-        </w:tc>
-        <w:tc>
-          <w:tcPr>
-            <w:tcW w:w="1870" w:type="dxa"/>
-            <w:tcMar>
-              <w:top w:w="0" w:type="dxa"/>
-              <w:left w:w="108" w:type="dxa"/>
-              <w:bottom w:w="0" w:type="dxa"/>
-              <w:right w:w="108" w:type="dxa"/>
-            </w:tcMar>
-            <w:hideMark/>
-          </w:tcPr>
-          <w:p>
-            <w:pPr>
-              <w:pStyle w:val="NormalWeb"/>
-              <w:spacing w:before="0" w:beforeAutospacing="0" w:after="0" w:afterAutospacing="0"/>
-              <w:jc w:val="center"/>
-              <w:rPr>
-                <w:sz w:val="20"/>
-                <w:szCs w:val="20"/>
-              </w:rPr>
-            </w:pPr>
-            <w:r>
-              <w:rPr>
-                <w:color w:val="000000"/>
-                <w:sz w:val="20"/>
-                <w:szCs w:val="20"/>
-              </w:rPr>
-              <w:t>45.3% male</w:t>
-            </w:r>
-          </w:p>
-          <w:p>
-            <w:pPr>
-              <w:pStyle w:val="NormalWeb"/>
-              <w:spacing w:before="0" w:beforeAutospacing="0" w:after="0" w:afterAutospacing="0"/>
-              <w:jc w:val="center"/>
-              <w:rPr>
-                <w:sz w:val="20"/>
-                <w:szCs w:val="20"/>
-              </w:rPr>
-            </w:pPr>
-            <w:r>
-              <w:rPr>
-                <w:color w:val="000000"/>
-                <w:sz w:val="20"/>
-                <w:szCs w:val="20"/>
-              </w:rPr>
-              <w:t>54.7% female</w:t>
-            </w:r>
-          </w:p>
-          <w:p>
-            <w:pPr>
-              <w:pStyle w:val="NormalWeb"/>
-              <w:spacing w:before="0" w:beforeAutospacing="0" w:after="0" w:afterAutospacing="0"/>
-              <w:jc w:val="center"/>
-              <w:rPr>
-                <w:sz w:val="20"/>
-                <w:szCs w:val="20"/>
-              </w:rPr>
-            </w:pPr>
-            <w:r>
-              <w:rPr>
-                <w:color w:val="000000"/>
-                <w:sz w:val="20"/>
-                <w:szCs w:val="20"/>
-              </w:rPr>
-              <w:t>70.7% married</w:t>
-            </w:r>
-          </w:p>
-        </w:tc>
-        <w:tc>
-          <w:tcPr>
-            <w:tcW w:w="1870" w:type="dxa"/>
-            <w:tcMar>
-              <w:top w:w="0" w:type="dxa"/>
-              <w:left w:w="108" w:type="dxa"/>
-              <w:bottom w:w="0" w:type="dxa"/>
-              <w:right w:w="108" w:type="dxa"/>
-            </w:tcMar>
-            <w:hideMark/>
-          </w:tcPr>
-          <w:p>
-            <w:pPr>
-              <w:pStyle w:val="NormalWeb"/>
-              <w:spacing w:before="0" w:beforeAutospacing="0" w:after="0" w:afterAutospacing="0"/>
-              <w:jc w:val="center"/>
-              <w:rPr>
-                <w:sz w:val="20"/>
-                <w:szCs w:val="20"/>
-              </w:rPr>
-            </w:pPr>
-            <w:r>
-              <w:rPr>
-                <w:color w:val="000000"/>
-                <w:sz w:val="20"/>
-                <w:szCs w:val="20"/>
-              </w:rPr>
-              <w:t>Women more likely to adopt</w:t>
-            </w:r>
-          </w:p>
-        </w:tc>
-      </w:tr>
-      <w:tr>
-        <w:trPr>
-          <w:trHeight w:val="288"/>
-          <w:jc w:val="center"/>
-        </w:trPr>
-        <w:tc>
-          <w:tcPr>
-            <w:tcW w:w="1870" w:type="dxa"/>
-            <w:tcMar>
-              <w:top w:w="0" w:type="dxa"/>
-              <w:left w:w="108" w:type="dxa"/>
-              <w:bottom w:w="0" w:type="dxa"/>
-              <w:right w:w="108" w:type="dxa"/>
-            </w:tcMar>
-            <w:hideMark/>
-          </w:tcPr>
-          <w:p>
-            <w:pPr>
-              <w:pStyle w:val="NormalWeb"/>
-              <w:spacing w:before="0" w:beforeAutospacing="0" w:after="0" w:afterAutospacing="0"/>
-              <w:rPr>
-                <w:sz w:val="20"/>
-                <w:szCs w:val="20"/>
-              </w:rPr>
-            </w:pPr>
-            <w:hyperlink r:id="rId13" w:history="1">
-              <w:r>
-                <w:rPr>
-                  <w:rStyle w:val="Hyperlink"/>
-                  <w:color w:val="000000"/>
-                  <w:sz w:val="20"/>
-                  <w:szCs w:val="20"/>
-                </w:rPr>
-                <w:t>(</w:t>
-              </w:r>
-              <w:proofErr w:type="spellStart"/>
-              <w:r>
-                <w:rPr>
-                  <w:rStyle w:val="Hyperlink"/>
-                  <w:color w:val="000000"/>
-                  <w:sz w:val="20"/>
-                  <w:szCs w:val="20"/>
-                </w:rPr>
-                <w:t>Obisesan</w:t>
-              </w:r>
-              <w:proofErr w:type="spellEnd"/>
-              <w:r>
-                <w:rPr>
-                  <w:rStyle w:val="Hyperlink"/>
-                  <w:color w:val="000000"/>
-                  <w:sz w:val="20"/>
-                  <w:szCs w:val="20"/>
-                </w:rPr>
-                <w:t xml:space="preserve"> 2014)</w:t>
-              </w:r>
-            </w:hyperlink>
-          </w:p>
-        </w:tc>
-        <w:tc>
-          <w:tcPr>
-            <w:tcW w:w="1870" w:type="dxa"/>
-            <w:tcMar>
-              <w:top w:w="0" w:type="dxa"/>
-              <w:left w:w="108" w:type="dxa"/>
-              <w:bottom w:w="0" w:type="dxa"/>
-              <w:right w:w="108" w:type="dxa"/>
-            </w:tcMar>
-            <w:hideMark/>
-          </w:tcPr>
-          <w:p>
-            <w:pPr>
-              <w:pStyle w:val="NormalWeb"/>
-              <w:spacing w:before="0" w:beforeAutospacing="0" w:after="0" w:afterAutospacing="0"/>
-              <w:jc w:val="center"/>
-              <w:rPr>
-                <w:sz w:val="20"/>
-                <w:szCs w:val="20"/>
-              </w:rPr>
-            </w:pPr>
-            <w:r>
-              <w:rPr>
-                <w:color w:val="000000"/>
-                <w:sz w:val="20"/>
-                <w:szCs w:val="20"/>
-              </w:rPr>
-              <w:t>482 HH </w:t>
-            </w:r>
-          </w:p>
-        </w:tc>
-        <w:tc>
-          <w:tcPr>
-            <w:tcW w:w="1870" w:type="dxa"/>
-            <w:tcMar>
-              <w:top w:w="0" w:type="dxa"/>
-              <w:left w:w="108" w:type="dxa"/>
-              <w:bottom w:w="0" w:type="dxa"/>
-              <w:right w:w="108" w:type="dxa"/>
-            </w:tcMar>
-            <w:hideMark/>
-          </w:tcPr>
-          <w:p>
-            <w:pPr>
-              <w:pStyle w:val="NormalWeb"/>
-              <w:spacing w:before="0" w:beforeAutospacing="0" w:after="0" w:afterAutospacing="0"/>
-              <w:jc w:val="center"/>
-              <w:rPr>
-                <w:sz w:val="20"/>
-                <w:szCs w:val="20"/>
-              </w:rPr>
-            </w:pPr>
-            <w:r>
-              <w:rPr>
-                <w:color w:val="000000"/>
-                <w:sz w:val="20"/>
-                <w:szCs w:val="20"/>
-              </w:rPr>
-              <w:t>Household</w:t>
-            </w:r>
-          </w:p>
-        </w:tc>
-        <w:tc>
-          <w:tcPr>
-            <w:tcW w:w="1870" w:type="dxa"/>
-            <w:tcMar>
-              <w:top w:w="0" w:type="dxa"/>
-              <w:left w:w="108" w:type="dxa"/>
-              <w:bottom w:w="0" w:type="dxa"/>
-              <w:right w:w="108" w:type="dxa"/>
-            </w:tcMar>
-            <w:hideMark/>
-          </w:tcPr>
-          <w:p>
-            <w:pPr>
-              <w:pStyle w:val="NormalWeb"/>
-              <w:spacing w:before="0" w:beforeAutospacing="0" w:after="0" w:afterAutospacing="0"/>
-              <w:jc w:val="center"/>
-              <w:rPr>
-                <w:sz w:val="20"/>
-                <w:szCs w:val="20"/>
-              </w:rPr>
-            </w:pPr>
-            <w:r>
-              <w:rPr>
-                <w:color w:val="000000"/>
-                <w:sz w:val="20"/>
-                <w:szCs w:val="20"/>
-              </w:rPr>
-              <w:t>76.23% male</w:t>
-            </w:r>
-          </w:p>
-          <w:p>
-            <w:pPr>
-              <w:pStyle w:val="NormalWeb"/>
-              <w:spacing w:before="0" w:beforeAutospacing="0" w:after="0" w:afterAutospacing="0"/>
-              <w:jc w:val="center"/>
-              <w:rPr>
-                <w:sz w:val="20"/>
-                <w:szCs w:val="20"/>
-              </w:rPr>
-            </w:pPr>
-            <w:r>
-              <w:rPr>
-                <w:color w:val="000000"/>
-                <w:sz w:val="20"/>
-                <w:szCs w:val="20"/>
-              </w:rPr>
-              <w:t>23.8% female</w:t>
-            </w:r>
-          </w:p>
-        </w:tc>
-        <w:tc>
-          <w:tcPr>
-            <w:tcW w:w="1870" w:type="dxa"/>
-            <w:tcMar>
-              <w:top w:w="0" w:type="dxa"/>
-              <w:left w:w="108" w:type="dxa"/>
-              <w:bottom w:w="0" w:type="dxa"/>
-              <w:right w:w="108" w:type="dxa"/>
-            </w:tcMar>
-            <w:hideMark/>
-          </w:tcPr>
-          <w:p>
-            <w:pPr>
-              <w:pStyle w:val="NormalWeb"/>
-              <w:spacing w:before="0" w:beforeAutospacing="0" w:after="0" w:afterAutospacing="0"/>
-              <w:jc w:val="center"/>
-              <w:rPr>
-                <w:sz w:val="20"/>
-                <w:szCs w:val="20"/>
-              </w:rPr>
-            </w:pPr>
-            <w:r>
-              <w:rPr>
-                <w:color w:val="000000"/>
-                <w:sz w:val="20"/>
-                <w:szCs w:val="20"/>
-              </w:rPr>
-              <w:t>Men more likely to adopt</w:t>
-            </w:r>
-          </w:p>
-        </w:tc>
-      </w:tr>
-      <w:tr>
-        <w:trPr>
-          <w:trHeight w:val="288"/>
-          <w:jc w:val="center"/>
-        </w:trPr>
-        <w:tc>
-          <w:tcPr>
-            <w:tcW w:w="1870" w:type="dxa"/>
-            <w:tcMar>
-              <w:top w:w="0" w:type="dxa"/>
-              <w:left w:w="108" w:type="dxa"/>
-              <w:bottom w:w="0" w:type="dxa"/>
-              <w:right w:w="108" w:type="dxa"/>
-            </w:tcMar>
-            <w:hideMark/>
-          </w:tcPr>
-          <w:p>
-            <w:pPr>
-              <w:pStyle w:val="NormalWeb"/>
-              <w:spacing w:before="0" w:beforeAutospacing="0" w:after="0" w:afterAutospacing="0"/>
-              <w:rPr>
-                <w:sz w:val="20"/>
-                <w:szCs w:val="20"/>
-              </w:rPr>
-            </w:pPr>
-            <w:hyperlink r:id="rId14" w:history="1">
-              <w:r>
-                <w:rPr>
-                  <w:rStyle w:val="Hyperlink"/>
-                  <w:color w:val="000000"/>
-                  <w:sz w:val="20"/>
-                  <w:szCs w:val="20"/>
-                </w:rPr>
-                <w:t>(</w:t>
-              </w:r>
-              <w:proofErr w:type="spellStart"/>
-              <w:r>
-                <w:rPr>
-                  <w:rStyle w:val="Hyperlink"/>
-                  <w:color w:val="000000"/>
-                  <w:sz w:val="20"/>
-                  <w:szCs w:val="20"/>
-                </w:rPr>
-                <w:t>Udensi</w:t>
-              </w:r>
-              <w:proofErr w:type="spellEnd"/>
-              <w:r>
-                <w:rPr>
-                  <w:rStyle w:val="Hyperlink"/>
-                  <w:color w:val="000000"/>
-                  <w:sz w:val="20"/>
-                  <w:szCs w:val="20"/>
-                </w:rPr>
-                <w:t xml:space="preserve"> et al. 2011)</w:t>
-              </w:r>
-            </w:hyperlink>
-          </w:p>
-        </w:tc>
-        <w:tc>
-          <w:tcPr>
-            <w:tcW w:w="1870" w:type="dxa"/>
-            <w:tcMar>
-              <w:top w:w="0" w:type="dxa"/>
-              <w:left w:w="108" w:type="dxa"/>
-              <w:bottom w:w="0" w:type="dxa"/>
-              <w:right w:w="108" w:type="dxa"/>
-            </w:tcMar>
-            <w:hideMark/>
-          </w:tcPr>
-          <w:p>
-            <w:pPr>
-              <w:pStyle w:val="NormalWeb"/>
-              <w:spacing w:before="0" w:beforeAutospacing="0" w:after="0" w:afterAutospacing="0"/>
-              <w:jc w:val="center"/>
-              <w:rPr>
-                <w:sz w:val="20"/>
-                <w:szCs w:val="20"/>
-              </w:rPr>
-            </w:pPr>
-            <w:r>
-              <w:rPr>
-                <w:color w:val="000000"/>
-                <w:sz w:val="20"/>
-                <w:szCs w:val="20"/>
-              </w:rPr>
-              <w:t>510 F</w:t>
-            </w:r>
-          </w:p>
-        </w:tc>
-        <w:tc>
-          <w:tcPr>
-            <w:tcW w:w="1870" w:type="dxa"/>
-            <w:tcMar>
-              <w:top w:w="0" w:type="dxa"/>
-              <w:left w:w="108" w:type="dxa"/>
-              <w:bottom w:w="0" w:type="dxa"/>
-              <w:right w:w="108" w:type="dxa"/>
-            </w:tcMar>
-            <w:hideMark/>
-          </w:tcPr>
-          <w:p>
-            <w:pPr>
-              <w:pStyle w:val="NormalWeb"/>
-              <w:spacing w:before="0" w:beforeAutospacing="0" w:after="0" w:afterAutospacing="0"/>
-              <w:jc w:val="center"/>
-              <w:rPr>
-                <w:sz w:val="20"/>
-                <w:szCs w:val="20"/>
-              </w:rPr>
-            </w:pPr>
-            <w:r>
-              <w:rPr>
-                <w:color w:val="000000"/>
-                <w:sz w:val="20"/>
-                <w:szCs w:val="20"/>
-              </w:rPr>
-              <w:t>Community list of Farmers</w:t>
-            </w:r>
-          </w:p>
-        </w:tc>
-        <w:tc>
-          <w:tcPr>
-            <w:tcW w:w="1870" w:type="dxa"/>
-            <w:tcMar>
-              <w:top w:w="0" w:type="dxa"/>
-              <w:left w:w="108" w:type="dxa"/>
-              <w:bottom w:w="0" w:type="dxa"/>
-              <w:right w:w="108" w:type="dxa"/>
-            </w:tcMar>
-            <w:hideMark/>
-          </w:tcPr>
-          <w:p>
-            <w:pPr>
-              <w:pStyle w:val="NormalWeb"/>
-              <w:spacing w:before="0" w:beforeAutospacing="0" w:after="0" w:afterAutospacing="0"/>
-              <w:jc w:val="center"/>
-              <w:rPr>
-                <w:sz w:val="20"/>
-                <w:szCs w:val="20"/>
-              </w:rPr>
-            </w:pPr>
-            <w:r>
-              <w:rPr>
-                <w:color w:val="000000"/>
-                <w:sz w:val="20"/>
-                <w:szCs w:val="20"/>
-              </w:rPr>
-              <w:t>43.5% male</w:t>
-            </w:r>
-          </w:p>
-          <w:p>
-            <w:pPr>
-              <w:pStyle w:val="NormalWeb"/>
-              <w:spacing w:before="0" w:beforeAutospacing="0" w:after="0" w:afterAutospacing="0"/>
-              <w:jc w:val="center"/>
-              <w:rPr>
-                <w:sz w:val="20"/>
-                <w:szCs w:val="20"/>
-              </w:rPr>
-            </w:pPr>
-            <w:r>
-              <w:rPr>
-                <w:color w:val="000000"/>
-                <w:sz w:val="20"/>
-                <w:szCs w:val="20"/>
-              </w:rPr>
-              <w:t>56.5% female</w:t>
-            </w:r>
-          </w:p>
-          <w:p>
-            <w:pPr>
-              <w:pStyle w:val="NormalWeb"/>
-              <w:spacing w:before="0" w:beforeAutospacing="0" w:after="0" w:afterAutospacing="0"/>
-              <w:jc w:val="center"/>
-              <w:rPr>
-                <w:sz w:val="20"/>
-                <w:szCs w:val="20"/>
-              </w:rPr>
-            </w:pPr>
-            <w:r>
-              <w:rPr>
-                <w:color w:val="000000"/>
-                <w:sz w:val="20"/>
-                <w:szCs w:val="20"/>
-              </w:rPr>
-              <w:t>78.8% married</w:t>
-            </w:r>
-          </w:p>
-        </w:tc>
-        <w:tc>
-          <w:tcPr>
-            <w:tcW w:w="1870" w:type="dxa"/>
-            <w:tcMar>
-              <w:top w:w="0" w:type="dxa"/>
-              <w:left w:w="108" w:type="dxa"/>
-              <w:bottom w:w="0" w:type="dxa"/>
-              <w:right w:w="108" w:type="dxa"/>
-            </w:tcMar>
-            <w:hideMark/>
-          </w:tcPr>
-          <w:p>
-            <w:pPr>
-              <w:pStyle w:val="NormalWeb"/>
-              <w:spacing w:before="0" w:beforeAutospacing="0" w:after="0" w:afterAutospacing="0"/>
-              <w:jc w:val="center"/>
-              <w:rPr>
-                <w:sz w:val="20"/>
-                <w:szCs w:val="20"/>
-              </w:rPr>
-            </w:pPr>
-            <w:r>
-              <w:rPr>
-                <w:color w:val="000000"/>
-                <w:sz w:val="20"/>
-                <w:szCs w:val="20"/>
-              </w:rPr>
-              <w:t>Gender not significant in</w:t>
-            </w:r>
-          </w:p>
-          <w:p>
-            <w:pPr>
-              <w:pStyle w:val="NormalWeb"/>
-              <w:spacing w:before="0" w:beforeAutospacing="0" w:after="0" w:afterAutospacing="0"/>
-              <w:jc w:val="center"/>
-              <w:rPr>
-                <w:sz w:val="20"/>
-                <w:szCs w:val="20"/>
-              </w:rPr>
-            </w:pPr>
-            <w:r>
-              <w:rPr>
-                <w:color w:val="000000"/>
-                <w:sz w:val="20"/>
-                <w:szCs w:val="20"/>
-              </w:rPr>
-              <w:t>ICV adoption</w:t>
-            </w:r>
-          </w:p>
-        </w:tc>
-      </w:tr>
-      <w:tr>
-        <w:trPr>
-          <w:trHeight w:val="288"/>
-          <w:jc w:val="center"/>
-        </w:trPr>
-        <w:tc>
-          <w:tcPr>
-            <w:tcW w:w="1870" w:type="dxa"/>
-            <w:tcMar>
-              <w:top w:w="0" w:type="dxa"/>
-              <w:left w:w="108" w:type="dxa"/>
-              <w:bottom w:w="0" w:type="dxa"/>
-              <w:right w:w="108" w:type="dxa"/>
-            </w:tcMar>
-            <w:hideMark/>
-          </w:tcPr>
-          <w:p>
-            <w:pPr>
-              <w:pStyle w:val="NormalWeb"/>
-              <w:spacing w:before="0" w:beforeAutospacing="0" w:after="0" w:afterAutospacing="0"/>
-              <w:rPr>
-                <w:sz w:val="20"/>
-                <w:szCs w:val="20"/>
-              </w:rPr>
-            </w:pPr>
-            <w:hyperlink r:id="rId15" w:history="1">
-              <w:r>
-                <w:rPr>
-                  <w:rStyle w:val="Hyperlink"/>
-                  <w:color w:val="000000"/>
-                  <w:sz w:val="20"/>
-                  <w:szCs w:val="20"/>
-                </w:rPr>
-                <w:t>(</w:t>
-              </w:r>
-              <w:proofErr w:type="spellStart"/>
-              <w:r>
-                <w:rPr>
-                  <w:rStyle w:val="Hyperlink"/>
-                  <w:color w:val="000000"/>
-                  <w:sz w:val="20"/>
-                  <w:szCs w:val="20"/>
-                </w:rPr>
-                <w:t>Assfaw</w:t>
-              </w:r>
-              <w:proofErr w:type="spellEnd"/>
-              <w:r>
-                <w:rPr>
-                  <w:rStyle w:val="Hyperlink"/>
-                  <w:color w:val="000000"/>
-                  <w:sz w:val="20"/>
-                  <w:szCs w:val="20"/>
-                </w:rPr>
-                <w:t xml:space="preserve"> </w:t>
-              </w:r>
-              <w:proofErr w:type="spellStart"/>
-              <w:r>
-                <w:rPr>
-                  <w:rStyle w:val="Hyperlink"/>
-                  <w:color w:val="000000"/>
-                  <w:sz w:val="20"/>
-                  <w:szCs w:val="20"/>
-                </w:rPr>
-                <w:t>Wossen</w:t>
-              </w:r>
-              <w:proofErr w:type="spellEnd"/>
-              <w:r>
-                <w:rPr>
-                  <w:rStyle w:val="Hyperlink"/>
-                  <w:color w:val="000000"/>
-                  <w:sz w:val="20"/>
-                  <w:szCs w:val="20"/>
-                </w:rPr>
-                <w:t xml:space="preserve"> et al. 2017)</w:t>
-              </w:r>
-            </w:hyperlink>
-          </w:p>
-        </w:tc>
-        <w:tc>
-          <w:tcPr>
-            <w:tcW w:w="1870" w:type="dxa"/>
-            <w:tcMar>
-              <w:top w:w="0" w:type="dxa"/>
-              <w:left w:w="108" w:type="dxa"/>
-              <w:bottom w:w="0" w:type="dxa"/>
-              <w:right w:w="108" w:type="dxa"/>
-            </w:tcMar>
-            <w:hideMark/>
-          </w:tcPr>
-          <w:p>
-            <w:pPr>
-              <w:pStyle w:val="NormalWeb"/>
-              <w:spacing w:before="0" w:beforeAutospacing="0" w:after="0" w:afterAutospacing="0"/>
-              <w:jc w:val="center"/>
-              <w:rPr>
-                <w:sz w:val="20"/>
-                <w:szCs w:val="20"/>
-              </w:rPr>
-            </w:pPr>
-            <w:r>
-              <w:rPr>
-                <w:color w:val="000000"/>
-                <w:sz w:val="20"/>
-                <w:szCs w:val="20"/>
-              </w:rPr>
-              <w:t>2500 HH </w:t>
-            </w:r>
-          </w:p>
-        </w:tc>
-        <w:tc>
-          <w:tcPr>
-            <w:tcW w:w="1870" w:type="dxa"/>
-            <w:tcMar>
-              <w:top w:w="0" w:type="dxa"/>
-              <w:left w:w="108" w:type="dxa"/>
-              <w:bottom w:w="0" w:type="dxa"/>
-              <w:right w:w="108" w:type="dxa"/>
-            </w:tcMar>
-            <w:hideMark/>
-          </w:tcPr>
-          <w:p>
-            <w:pPr>
-              <w:pStyle w:val="NormalWeb"/>
-              <w:spacing w:before="0" w:beforeAutospacing="0" w:after="0" w:afterAutospacing="0"/>
-              <w:jc w:val="center"/>
-              <w:rPr>
-                <w:sz w:val="20"/>
-                <w:szCs w:val="20"/>
-              </w:rPr>
-            </w:pPr>
-            <w:r>
-              <w:rPr>
-                <w:color w:val="000000"/>
-                <w:sz w:val="20"/>
-                <w:szCs w:val="20"/>
-              </w:rPr>
-              <w:t>Household heads</w:t>
-            </w:r>
-          </w:p>
-        </w:tc>
-        <w:tc>
-          <w:tcPr>
-            <w:tcW w:w="1870" w:type="dxa"/>
-            <w:tcMar>
-              <w:top w:w="0" w:type="dxa"/>
-              <w:left w:w="108" w:type="dxa"/>
-              <w:bottom w:w="0" w:type="dxa"/>
-              <w:right w:w="108" w:type="dxa"/>
-            </w:tcMar>
-            <w:hideMark/>
-          </w:tcPr>
-          <w:p>
-            <w:pPr>
-              <w:pStyle w:val="NormalWeb"/>
-              <w:spacing w:before="0" w:beforeAutospacing="0" w:after="0" w:afterAutospacing="0"/>
-              <w:jc w:val="center"/>
-              <w:rPr>
-                <w:sz w:val="20"/>
-                <w:szCs w:val="20"/>
-              </w:rPr>
-            </w:pPr>
-            <w:r>
-              <w:rPr>
-                <w:color w:val="000000"/>
-                <w:sz w:val="20"/>
-                <w:szCs w:val="20"/>
-              </w:rPr>
-              <w:t>-</w:t>
-            </w:r>
-          </w:p>
-        </w:tc>
-        <w:tc>
-          <w:tcPr>
-            <w:tcW w:w="1870" w:type="dxa"/>
-            <w:tcMar>
-              <w:top w:w="0" w:type="dxa"/>
-              <w:left w:w="108" w:type="dxa"/>
-              <w:bottom w:w="0" w:type="dxa"/>
-              <w:right w:w="108" w:type="dxa"/>
-            </w:tcMar>
-            <w:hideMark/>
-          </w:tcPr>
-          <w:p>
-            <w:pPr>
-              <w:pStyle w:val="NormalWeb"/>
-              <w:spacing w:before="0" w:beforeAutospacing="0" w:after="0" w:afterAutospacing="0"/>
-              <w:jc w:val="center"/>
-              <w:rPr>
-                <w:sz w:val="20"/>
-                <w:szCs w:val="20"/>
-              </w:rPr>
-            </w:pPr>
-            <w:r>
-              <w:rPr>
-                <w:color w:val="000000"/>
-                <w:sz w:val="20"/>
-                <w:szCs w:val="20"/>
-              </w:rPr>
-              <w:t>Men</w:t>
-            </w:r>
-            <w:r>
-              <w:rPr>
-                <w:color w:val="000000"/>
-                <w:sz w:val="20"/>
-                <w:szCs w:val="20"/>
-              </w:rPr>
-              <w:t xml:space="preserve"> are</w:t>
-            </w:r>
-            <w:r>
-              <w:rPr>
-                <w:color w:val="000000"/>
-                <w:sz w:val="20"/>
-                <w:szCs w:val="20"/>
-              </w:rPr>
-              <w:t xml:space="preserve"> more likely to </w:t>
-            </w:r>
-            <w:r>
-              <w:rPr>
-                <w:color w:val="000000"/>
-                <w:sz w:val="20"/>
-                <w:szCs w:val="20"/>
-              </w:rPr>
-              <w:t xml:space="preserve">adopt. </w:t>
-            </w:r>
-            <w:r>
-              <w:rPr>
-                <w:color w:val="000000"/>
-                <w:sz w:val="20"/>
-                <w:szCs w:val="20"/>
-              </w:rPr>
-              <w:t>ICV except when</w:t>
-            </w:r>
-            <w:r>
-              <w:rPr>
-                <w:color w:val="000000"/>
-                <w:sz w:val="20"/>
-                <w:szCs w:val="20"/>
-              </w:rPr>
-              <w:t xml:space="preserve"> </w:t>
-            </w:r>
-            <w:r>
-              <w:rPr>
-                <w:color w:val="000000"/>
-                <w:sz w:val="20"/>
-                <w:szCs w:val="20"/>
-              </w:rPr>
-              <w:t>adoption</w:t>
-            </w:r>
-            <w:r>
-              <w:rPr>
-                <w:color w:val="000000"/>
-                <w:sz w:val="20"/>
-                <w:szCs w:val="20"/>
-              </w:rPr>
-              <w:t xml:space="preserve"> </w:t>
-            </w:r>
-            <w:r>
-              <w:rPr>
-                <w:color w:val="000000"/>
-                <w:sz w:val="20"/>
-                <w:szCs w:val="20"/>
-              </w:rPr>
-              <w:t>is measured by DNA fingerprinting</w:t>
-            </w:r>
-          </w:p>
-        </w:tc>
-      </w:tr>
-    </w:tbl>
     <w:p>
       <w:r>
         <w:rPr>
@@ -3844,31 +1858,7 @@
           <w:color w:val="000000"/>
         </w:rPr>
         <w:lastRenderedPageBreak/>
-        <w:t xml:space="preserve">The mean differences by gender presented in Table </w:t>
-      </w:r>
-      <w:r>
-        <w:rPr>
-          <w:color w:val="000000"/>
-        </w:rPr>
-        <w:t>X</w:t>
-      </w:r>
-      <w:r>
-        <w:rPr>
-          <w:color w:val="000000"/>
-        </w:rPr>
-        <w:t xml:space="preserve"> </w:t>
-      </w:r>
-      <w:r>
-        <w:rPr>
-          <w:color w:val="000000"/>
-        </w:rPr>
-        <w:t>show</w:t>
-      </w:r>
-      <w:r>
-        <w:rPr>
-          <w:color w:val="000000"/>
-        </w:rPr>
-        <w:t xml:space="preserve"> that the mean of the Y/N ICV variable is higher for husbands than for wives in three of the four zones (Zone 2, 3, and 4). This further confirms that husbands are likelier to report that their household has adopted the new agricultural technology than wives.</w:t>
+        <w:t>The mean differences by gender presented in Table X show that the mean of the Y/N ICV variable is higher for husbands than for wives in three of the four zones (Zone 2, 3, and 4). This further confirms that husbands are likelier to report that their household has adopted the new agricultural technology than wives.</w:t>
       </w:r>
     </w:p>
     <w:p>
@@ -3910,23 +1900,7 @@
           <w:bCs/>
           <w:color w:val="000000"/>
         </w:rPr>
-        <w:t xml:space="preserve">Table </w:t>
-      </w:r>
-      <w:r>
-        <w:rPr>
-          <w:b/>
-          <w:bCs/>
-          <w:color w:val="000000"/>
-        </w:rPr>
-        <w:t>X</w:t>
-      </w:r>
-      <w:r>
-        <w:rPr>
-          <w:b/>
-          <w:bCs/>
-          <w:color w:val="000000"/>
-        </w:rPr>
-        <w:t>—Descriptive statistics and results from the test and mean differences by gender</w:t>
+        <w:t>Table X—Descriptive statistics and results from the test and mean differences by gender</w:t>
       </w:r>
     </w:p>
     <w:tbl>
@@ -12354,43 +10328,7 @@
           <w:color w:val="000000"/>
         </w:rPr>
         <w:lastRenderedPageBreak/>
-        <w:t xml:space="preserve">Figure </w:t>
-      </w:r>
-      <w:r>
-        <w:rPr>
-          <w:color w:val="000000"/>
-        </w:rPr>
-        <w:t>X</w:t>
-      </w:r>
-      <w:r>
-        <w:rPr>
-          <w:color w:val="000000"/>
-        </w:rPr>
-        <w:t xml:space="preserve"> shows the Comparison between the distributions between Household DNA-Fingerprinting, Male and Female datasets for the Y/N ICV and ICV Total variables. The Y/N ICV variable is a binary variable that indicates </w:t>
-      </w:r>
-      <w:r>
-        <w:rPr>
-          <w:color w:val="000000"/>
-        </w:rPr>
-        <w:t>whether</w:t>
-      </w:r>
-      <w:r>
-        <w:rPr>
-          <w:color w:val="000000"/>
-        </w:rPr>
-        <w:t xml:space="preserve"> a household has adopted a new agricultural technology. The ICV Total variable is a continuous variable that measures the intensity of adoption of the new technology. </w:t>
-      </w:r>
-      <w:r>
-        <w:rPr>
-          <w:color w:val="000000"/>
-        </w:rPr>
-        <w:t>Moreover</w:t>
-      </w:r>
-      <w:r>
-        <w:rPr>
-          <w:color w:val="000000"/>
-        </w:rPr>
-        <w:t>, the Figure suggests that there may be non-classical measurement errors in the reporting of technology adoption.  Specifically, women are more likely to underreport the intensity of their household's adoption of the new technology.</w:t>
+        <w:t>Figure X shows the Comparison between the distributions between Household DNA-Fingerprinting, Male and Female datasets for the Y/N ICV and ICV Total variables. The Y/N ICV variable is a binary variable that indicates whether a household has adopted a new agricultural technology. The ICV Total variable is a continuous variable that measures the intensity of adoption of the new technology. Moreover, the Figure suggests that there may be non-classical measurement errors in the reporting of technology adoption.  Specifically, women are more likely to underreport the intensity of their household's adoption of the new technology.</w:t>
       </w:r>
     </w:p>
     <w:p/>
@@ -12441,7 +10379,7 @@
                           <pic:cNvPicPr/>
                         </pic:nvPicPr>
                         <pic:blipFill>
-                          <a:blip r:embed="rId16" cstate="print">
+                          <a:blip r:embed="rId8" cstate="print">
                             <a:extLst>
                               <a:ext uri="{28A0092B-C50C-407E-A947-70E740481C1C}">
                                 <a14:useLocalDpi xmlns:a14="http://schemas.microsoft.com/office/drawing/2010/main" val="0"/>
@@ -12494,7 +10432,7 @@
                           <pic:cNvPicPr/>
                         </pic:nvPicPr>
                         <pic:blipFill>
-                          <a:blip r:embed="rId17" cstate="print">
+                          <a:blip r:embed="rId9" cstate="print">
                             <a:extLst>
                               <a:ext uri="{28A0092B-C50C-407E-A947-70E740481C1C}">
                                 <a14:useLocalDpi xmlns:a14="http://schemas.microsoft.com/office/drawing/2010/main" val="0"/>
@@ -12743,7 +10681,7 @@
                           </pic:cNvPicPr>
                         </pic:nvPicPr>
                         <pic:blipFill>
-                          <a:blip r:embed="rId18" cstate="print">
+                          <a:blip r:embed="rId10" cstate="print">
                             <a:extLst>
                               <a:ext uri="{28A0092B-C50C-407E-A947-70E740481C1C}">
                                 <a14:useLocalDpi xmlns:a14="http://schemas.microsoft.com/office/drawing/2010/main" val="0"/>
@@ -12807,7 +10745,7 @@
                           </pic:cNvPicPr>
                         </pic:nvPicPr>
                         <pic:blipFill>
-                          <a:blip r:embed="rId19" cstate="print">
+                          <a:blip r:embed="rId11" cstate="print">
                             <a:extLst>
                               <a:ext uri="{28A0092B-C50C-407E-A947-70E740481C1C}">
                                 <a14:useLocalDpi xmlns:a14="http://schemas.microsoft.com/office/drawing/2010/main" val="0"/>
@@ -12909,7 +10847,7 @@
                           </pic:cNvPicPr>
                         </pic:nvPicPr>
                         <pic:blipFill>
-                          <a:blip r:embed="rId20" cstate="print">
+                          <a:blip r:embed="rId12" cstate="print">
                             <a:extLst>
                               <a:ext uri="{28A0092B-C50C-407E-A947-70E740481C1C}">
                                 <a14:useLocalDpi xmlns:a14="http://schemas.microsoft.com/office/drawing/2010/main" val="0"/>
@@ -12973,7 +10911,7 @@
                           </pic:cNvPicPr>
                         </pic:nvPicPr>
                         <pic:blipFill>
-                          <a:blip r:embed="rId21" cstate="print">
+                          <a:blip r:embed="rId13" cstate="print">
                             <a:extLst>
                               <a:ext uri="{28A0092B-C50C-407E-A947-70E740481C1C}">
                                 <a14:useLocalDpi xmlns:a14="http://schemas.microsoft.com/office/drawing/2010/main" val="0"/>
@@ -13027,21 +10965,7 @@
                 <w:sz w:val="20"/>
                 <w:szCs w:val="18"/>
               </w:rPr>
-              <w:t>5</w:t>
-            </w:r>
-            <w:r>
-              <w:rPr>
-                <w:sz w:val="20"/>
-                <w:szCs w:val="18"/>
-              </w:rPr>
-              <w:t>00</w:t>
-            </w:r>
-            <w:r>
-              <w:rPr>
-                <w:sz w:val="20"/>
-                <w:szCs w:val="18"/>
-              </w:rPr>
-              <w:t xml:space="preserve"> iterations of each percentage of female</w:t>
+              <w:t>500 iterations of each percentage of female</w:t>
             </w:r>
           </w:p>
         </w:tc>
@@ -23391,6 +21315,7 @@
   <w:style w:type="character" w:default="1" w:styleId="DefaultParagraphFont">
     <w:name w:val="Default Paragraph Font"/>
     <w:uiPriority w:val="1"/>
+    <w:semiHidden/>
     <w:unhideWhenUsed/>
   </w:style>
   <w:style w:type="table" w:default="1" w:styleId="TableNormal">
@@ -23829,23 +21754,6 @@
 </file>
 
 <file path=customXml/item2.xml><?xml version="1.0" encoding="utf-8"?>
-<p:properties xmlns:p="http://schemas.microsoft.com/office/2006/metadata/properties" xmlns:xsi="http://www.w3.org/2001/XMLSchema-instance" xmlns:pc="http://schemas.microsoft.com/office/infopath/2007/PartnerControls">
-  <documentManagement>
-    <_activity xmlns="a4d26d5d-4570-4008-8382-60aa76aff976" xsi:nil="true"/>
-  </documentManagement>
-</p:properties>
-</file>
-
-<file path=customXml/item3.xml><?xml version="1.0" encoding="utf-8"?>
-<?mso-contentType ?>
-<FormTemplates xmlns="http://schemas.microsoft.com/sharepoint/v3/contenttype/forms">
-  <Display>DocumentLibraryForm</Display>
-  <Edit>DocumentLibraryForm</Edit>
-  <New>DocumentLibraryForm</New>
-</FormTemplates>
-</file>
-
-<file path=customXml/item4.xml><?xml version="1.0" encoding="utf-8"?>
 <ct:contentTypeSchema xmlns:ct="http://schemas.microsoft.com/office/2006/metadata/contentType" xmlns:ma="http://schemas.microsoft.com/office/2006/metadata/properties/metaAttributes" ct:_="" ma:_="" ma:contentTypeName="Document" ma:contentTypeID="0x0101006B8B54C188BBC64296D45930E871EB27" ma:contentTypeVersion="4" ma:contentTypeDescription="Create a new document." ma:contentTypeScope="" ma:versionID="acfb631a49df3b94fcead21c057587e4">
   <xsd:schema xmlns:xsd="http://www.w3.org/2001/XMLSchema" xmlns:xs="http://www.w3.org/2001/XMLSchema" xmlns:p="http://schemas.microsoft.com/office/2006/metadata/properties" xmlns:ns3="a4d26d5d-4570-4008-8382-60aa76aff976" targetNamespace="http://schemas.microsoft.com/office/2006/metadata/properties" ma:root="true" ma:fieldsID="0936b094fde6e94586367d68a2257641" ns3:_="">
     <xsd:import namespace="a4d26d5d-4570-4008-8382-60aa76aff976"/>
@@ -23989,6 +21897,23 @@
 </ct:contentTypeSchema>
 </file>
 
+<file path=customXml/item3.xml><?xml version="1.0" encoding="utf-8"?>
+<?mso-contentType ?>
+<FormTemplates xmlns="http://schemas.microsoft.com/sharepoint/v3/contenttype/forms">
+  <Display>DocumentLibraryForm</Display>
+  <Edit>DocumentLibraryForm</Edit>
+  <New>DocumentLibraryForm</New>
+</FormTemplates>
+</file>
+
+<file path=customXml/item4.xml><?xml version="1.0" encoding="utf-8"?>
+<p:properties xmlns:p="http://schemas.microsoft.com/office/2006/metadata/properties" xmlns:xsi="http://www.w3.org/2001/XMLSchema-instance" xmlns:pc="http://schemas.microsoft.com/office/infopath/2007/PartnerControls">
+  <documentManagement>
+    <_activity xmlns="a4d26d5d-4570-4008-8382-60aa76aff976" xsi:nil="true"/>
+  </documentManagement>
+</p:properties>
+</file>
+
 <file path=customXml/itemProps1.xml><?xml version="1.0" encoding="utf-8"?>
 <ds:datastoreItem xmlns:ds="http://schemas.openxmlformats.org/officeDocument/2006/customXml" ds:itemID="{FC42274D-3AFE-4BEA-812F-974ACFB09427}">
   <ds:schemaRefs>
@@ -23998,24 +21923,6 @@
 </file>
 
 <file path=customXml/itemProps2.xml><?xml version="1.0" encoding="utf-8"?>
-<ds:datastoreItem xmlns:ds="http://schemas.openxmlformats.org/officeDocument/2006/customXml" ds:itemID="{2A781024-C34E-42D5-A895-7ACC9BBF6788}">
-  <ds:schemaRefs>
-    <ds:schemaRef ds:uri="http://schemas.microsoft.com/office/2006/metadata/properties"/>
-    <ds:schemaRef ds:uri="http://schemas.microsoft.com/office/infopath/2007/PartnerControls"/>
-    <ds:schemaRef ds:uri="a4d26d5d-4570-4008-8382-60aa76aff976"/>
-  </ds:schemaRefs>
-</ds:datastoreItem>
-</file>
-
-<file path=customXml/itemProps3.xml><?xml version="1.0" encoding="utf-8"?>
-<ds:datastoreItem xmlns:ds="http://schemas.openxmlformats.org/officeDocument/2006/customXml" ds:itemID="{15D70DC9-88D3-4D52-BEA4-C35979F19A2F}">
-  <ds:schemaRefs>
-    <ds:schemaRef ds:uri="http://schemas.microsoft.com/sharepoint/v3/contenttype/forms"/>
-  </ds:schemaRefs>
-</ds:datastoreItem>
-</file>
-
-<file path=customXml/itemProps4.xml><?xml version="1.0" encoding="utf-8"?>
 <ds:datastoreItem xmlns:ds="http://schemas.openxmlformats.org/officeDocument/2006/customXml" ds:itemID="{B2DA850D-BD2A-4C31-959D-F3F72D495B34}">
   <ds:schemaRefs>
     <ds:schemaRef ds:uri="http://schemas.microsoft.com/office/2006/metadata/contentType"/>
@@ -24031,4 +21938,22 @@
     <ds:schemaRef ds:uri="http://schemas.microsoft.com/internal/obd"/>
   </ds:schemaRefs>
 </ds:datastoreItem>
+</file>
+
+<file path=customXml/itemProps3.xml><?xml version="1.0" encoding="utf-8"?>
+<ds:datastoreItem xmlns:ds="http://schemas.openxmlformats.org/officeDocument/2006/customXml" ds:itemID="{15D70DC9-88D3-4D52-BEA4-C35979F19A2F}">
+  <ds:schemaRefs>
+    <ds:schemaRef ds:uri="http://schemas.microsoft.com/sharepoint/v3/contenttype/forms"/>
+  </ds:schemaRefs>
+</ds:datastoreItem>
+</file>
+
+<file path=customXml/itemProps4.xml><?xml version="1.0" encoding="utf-8"?>
+<ds:datastoreItem xmlns:ds="http://schemas.openxmlformats.org/officeDocument/2006/customXml" ds:itemID="{2A781024-C34E-42D5-A895-7ACC9BBF6788}">
+  <ds:schemaRefs>
+    <ds:schemaRef ds:uri="http://schemas.microsoft.com/office/2006/metadata/properties"/>
+    <ds:schemaRef ds:uri="http://schemas.microsoft.com/office/infopath/2007/PartnerControls"/>
+    <ds:schemaRef ds:uri="a4d26d5d-4570-4008-8382-60aa76aff976"/>
+  </ds:schemaRefs>
+</ds:datastoreItem>
 </file>
</xml_diff>